<commit_message>
Add PCF paper upgrade skill and revise manuscript
</commit_message>
<xml_diff>
--- a/docs/PAPER_DRAFT_v4.docx
+++ b/docs/PAPER_DRAFT_v4.docx
@@ -132,7 +132,7 @@
           <w:color w:val="202A32"/>
           <w:sz w:val="21"/>
         </w:rPr>
-        <w:t>Our evidence supports five linked findings. First, late patch content can be functionally replaceable under constrained interventions; this is not universal invariance. Second, replacement outcomes depend on feature geometry and token diversity. Third, functional transmission is anisotropic and depends on whether token perturbations add coherently or cancel. Fourth, an N=100 attention causal audit attributes most of the tested coherence-gap effect to the frozen-attention Value path; a separate N=100-perturbation multi-block study finds that the end-to-end operator predicts held-out damage better than a one-block operator, while subspaces rotate downstream. Fifth, the mechanism supports a constructive operator-aware compression result in a strict N=1,000-per-architecture confirmatory evaluation.</w:t>
+        <w:t>These results form a sequence of tests rather than a blanket claim of redundancy. Fixed-slot replacement isolates patch content and shows a late-layer regime in which some content is tolerated; geometry and diversity controls then identify conditions under which replacement fails. The transmission studies explain why equal-sized perturbations need not have equal consequences: sensitivity is anisotropic, and coherent patch changes can accumulate through the attention Value path while sign-varying changes partly cancel. Finally, a separate multi-block audit shows that the composed end-to-end operator predicts held-out perturbation damage better than a one-block map in the tested settings. This mechanistic chain motivates operator-aware compression, which we evaluate separately on 1,000 held-out images per architecture.</w:t>
       </w:r>
     </w:p>
     <w:p>
@@ -231,7 +231,7 @@
           <w:color w:val="202A32"/>
           <w:sz w:val="21"/>
         </w:rPr>
-        <w:t>DynamicViT and EViT reduce computation by selecting, reorganizing, or fusing tokens, while ToMe merges similar tokens during inference  citep{rao2021dynamicvit,liang2022evit,bolya2022tome}. These methods motivate efficient token reduction but do not test the same fixed-sequence activation-substitution question. Work on registers documents specialized high-norm background tokens in ViTs; it cautions against treating every patch position as semantically interchangeable  citep{darcet2023vision}. DINOv2 supplies one of the self-supervised model families in our evaluation  citep{oquab2024dinov2}.</w:t>
+        <w:t>DynamicViT learns to prune tokens progressively, EViT reorganizes tokens by retaining attentive tokens and fusing less attentive ones, and ToMe merges similar tokens during inference  citep{rao2021dynamicvit,liang2022evit,bolya2022tome}. These methods establish strong sequence-reduction approaches and motivate our compression comparisons. Their interventions change which tokens remain or how tokens are grouped; our mechanistic intervention changes patch activation content while preserving token slots, sequence length, and downstream weights. Work on registers further cautions against treating every patch position as interchangeable: some ViTs develop specialized high-norm background tokens  citep{darcet2023vision}. DINOv2 is one of the pretrained model families in our evaluation, rather than a token-reduction method  citep{oquab2024dinov2}.</w:t>
       </w:r>
     </w:p>
     <w:p>
@@ -245,7 +245,7 @@
           <w:color w:val="202A32"/>
           <w:sz w:val="21"/>
         </w:rPr>
-        <w:t>Output-sensitive compression, low-rank methods, and activation-space geometry are also established. SliceGPT and SVD-LLM compress language-model dimensions using transformed or truncated subspaces  citep{ashkboos2024slicegpt,wang2025svdllm}. Output-aware Residual Stream Pruning explicitly weights residual-stream compression by downstream output sensitivity  citep{thrash2026outputaware}. FishBack studies pullback Fisher geometry for activation steering in language models, and UniTAC studies task-conditioned image coding  citep{wang2026fishback,esfahanizadeh2026unitac}. These works are adjacent in objective or mathematical tools, but differ in task, model family, intervention, or output. We do not claim novelty for Jacobians, SVD, anisotropy, redundancy, pruning, or merging. We claim evidence for the specific causal and mechanistic chain in ViT patch activations and its confirmatory token-compression evaluation.</w:t>
+        <w:t>The mathematical ingredients for output-sensitive compression are also established. SliceGPT and SVD-LLM reduce language-model dimensions through transformed or truncated subspaces  citep{ashkboos2024slicegpt,wang2025svdllm}; Output-aware Residual Stream Pruning selects residual directions using downstream sensitivity  citep{thrash2026outputaware}. FishBack studies pullback Fisher geometry for activation steering in language models, while UniTAC applies task-weighted distortion to image coding  citep{wang2026fishback,esfahanizadeh2026unitac}. These works share tools or an output-sensitive objective with parts of our analysis, but differ in model family, intervention, or task. We therefore center the contribution on evidence for the connected ViT-specific chain: fixed-slot causal patch-content substitution, geometric and diversity constraints, Value-mediated coherence and cancellation, downstream functional transmission, and a separate confirmatory compression evaluation. We do not claim novelty for Jacobians, SVD, anisotropy in general, token redundancy, pruning, merging, low-rank operators, or generic output-aware compression.</w:t>
       </w:r>
     </w:p>
     <w:p>
@@ -274,7 +274,7 @@
           <w:color w:val="202A32"/>
           <w:sz w:val="21"/>
         </w:rPr>
-        <w:t xml:space="preserve">We distinguish four evidence units throughout. The attention causal audit evaluates </w:t>
+        <w:t xml:space="preserve">We keep the sample units for the mechanism, confirmatory compression, and carrier studies distinct. The attention causal audit evaluates </w:t>
       </w:r>
       <w:r>
         <w:rPr>
@@ -292,7 +292,7 @@
           <w:color w:val="202A32"/>
           <w:sz w:val="21"/>
         </w:rPr>
-        <w:t xml:space="preserve">; the functional-geometry pilot evaluates </w:t>
+        <w:t xml:space="preserve">, and the functional-geometry pilot separately evaluates </w:t>
       </w:r>
       <w:r>
         <w:rPr>
@@ -310,7 +310,7 @@
           <w:color w:val="202A32"/>
           <w:sz w:val="21"/>
         </w:rPr>
-        <w:t xml:space="preserve">; the multi-block operator audit evaluates </w:t>
+        <w:t xml:space="preserve">. The multi-block operator audit evaluates </w:t>
       </w:r>
       <w:r>
         <w:rPr>
@@ -328,7 +328,7 @@
           <w:color w:val="202A32"/>
           <w:sz w:val="21"/>
         </w:rPr>
-        <w:t xml:space="preserve">; and the strict operator-compression confirmatory evaluation uses </w:t>
+        <w:t xml:space="preserve">, not images. Strict operator-compression confirmation uses </w:t>
       </w:r>
       <w:r>
         <w:rPr>
@@ -346,7 +346,7 @@
           <w:color w:val="202A32"/>
           <w:sz w:val="21"/>
         </w:rPr>
-        <w:t xml:space="preserve">. The real practical carrier benchmark also uses </w:t>
+        <w:t xml:space="preserve">; the real classifier-carrier benchmark independently uses </w:t>
       </w:r>
       <w:r>
         <w:rPr>
@@ -364,7 +364,25 @@
           <w:color w:val="202A32"/>
           <w:sz w:val="21"/>
         </w:rPr>
-        <w:t xml:space="preserve"> for accuracy, with separate full-model timing runs. Operator-space experiments use their own N=100 held-out image set and are not classification evidence. The source manifests and claim traceability table record each unit and denominator.</w:t>
+        <w:t xml:space="preserve"> for accuracy, with separate full-model timing runs. Operator-space carrier experiments use a separate </w:t>
+      </w:r>
+      <w:r>
+        <w:rPr>
+          <w:rFonts w:ascii="Times New Roman" w:hAnsi="Times New Roman"/>
+          <w:b/>
+          <w:color w:val="202A32"/>
+          <w:sz w:val="21"/>
+        </w:rPr>
+        <w:t>N=100 held-out operator-space image set</w:t>
+      </w:r>
+      <w:r>
+        <w:rPr>
+          <w:rFonts w:ascii="Times New Roman" w:hAnsi="Times New Roman"/>
+          <w:i w:val="0"/>
+          <w:color w:val="202A32"/>
+          <w:sz w:val="21"/>
+        </w:rPr>
+        <w:t xml:space="preserve"> and do not measure classification. The source manifests and claim-traceability table record each unit and denominator.</w:t>
       </w:r>
     </w:p>
     <w:p>
@@ -1323,7 +1341,7 @@
           <w:color w:val="202A32"/>
           <w:sz w:val="21"/>
         </w:rPr>
-        <w:t>The mechanism studies are finite: N=100 images for the attention causal audit and functional-geometry pilot, and 100 held-out perturbations for multi-block operator prediction. Their conclusions should not be generalized beyond the tested architectures, layers, perturbations, or readouts. The confirmatory N=1,000 results cover four pretrained ViT families and a specific ImageNet validation subset; broader model and task coverage remains untested. The Jacobian objective is a local linearization, and real carrier classification shows that reducing this linearized error is not sufficient for a deployment gain.</w:t>
+        <w:t>The mechanism studies are finite: N=100 images for the attention causal audit and functional-geometry pilot, and N=100 held-out perturbations for multi-block operator prediction. Their conclusions should not be generalized beyond the tested architectures, layers, perturbations, or readouts. Confirmatory results cover four pretrained ViT families and a specific ImageNet validation subset of N=1,000 held-out images per architecture; broader model and task coverage remains untested. The Jacobian objective is a local linearization, and the full-J oracle is an offline reference that requires per-image downstream-Jacobian construction. Real carrier classification shows that reducing linearized error is not sufficient for a deployment gain; measured full-call runtime is also specific to the tested hardware, batch sizes, and implementations and does not isolate operator overhead.</w:t>
       </w:r>
     </w:p>
     <w:p>

</xml_diff>

<commit_message>
Refresh paper figures and add depth-6 follow-up
</commit_message>
<xml_diff>
--- a/docs/PAPER_DRAFT_v4.docx
+++ b/docs/PAPER_DRAFT_v4.docx
@@ -158,7 +158,7 @@
       <w:r>
         <w:drawing>
           <wp:inline xmlns:a="http://schemas.openxmlformats.org/drawingml/2006/main" xmlns:pic="http://schemas.openxmlformats.org/drawingml/2006/picture">
-            <wp:extent cx="5897880" cy="2453936"/>
+            <wp:extent cx="5897880" cy="3446413"/>
             <wp:docPr id="1" name="Picture 1"/>
             <wp:cNvGraphicFramePr>
               <a:graphicFrameLocks noChangeAspect="1"/>
@@ -179,7 +179,7 @@
                   <pic:spPr>
                     <a:xfrm>
                       <a:off x="0" y="0"/>
-                      <a:ext cx="5897880" cy="2453936"/>
+                      <a:ext cx="5897880" cy="3446413"/>
                     </a:xfrm>
                     <a:prstGeom prst="rect"/>
                   </pic:spPr>
@@ -461,7 +461,7 @@
           <w:color w:val="202A32"/>
           <w:sz w:val="21"/>
         </w:rPr>
-        <w:t>Across the audited replacement controls, late-layer patch content is more replaceable than early-layer content, but arbitrary substitutions do not preserve function. The V1 depthwise validation uses 1,000 images per architecture and reports Top-1 under 25% patch replacement. Figure 2 shows the ViT-B/16 AugReg and DINOv2 depth curves; the result is conditional on the tested models, layer, replacement fraction, calibration distribution, and readout.</w:t>
+        <w:t>Across the audited replacement controls, late-layer patch content is more replaceable than early-layer content, but arbitrary substitutions do not preserve function. The original V1 depthwise validation uses 1,000 images per architecture and reports Top-1 under 25% patch replacement. We subsequently measured the previously unsampled depth 6 in a separately recorded follow-up, using the same split seeds, replacement fraction, controls, and 1,000-image calibration and evaluation sets for ViT-B/16 AugReg and DINOv2. At depth 6, Centroid/Gaussian reach 73.9%/74.9% for ViT-B and 70.6%/74.6% for DINOv2, compared with Zero at 71.5%/28.8%; Gaussian values are means over three seeds. Figure 2 combines that follow-up with the original depths 5, 7, 8, 9, and 10. These results remain conditional on the tested models, layer, replacement fraction, calibration distribution, and readout.</w:t>
       </w:r>
     </w:p>
     <w:p>
@@ -505,7 +505,7 @@
       <w:r>
         <w:drawing>
           <wp:inline xmlns:a="http://schemas.openxmlformats.org/drawingml/2006/main" xmlns:pic="http://schemas.openxmlformats.org/drawingml/2006/picture">
-            <wp:extent cx="5897880" cy="2448354"/>
+            <wp:extent cx="5897880" cy="2254632"/>
             <wp:docPr id="2" name="Picture 2"/>
             <wp:cNvGraphicFramePr>
               <a:graphicFrameLocks noChangeAspect="1"/>
@@ -526,7 +526,7 @@
                   <pic:spPr>
                     <a:xfrm>
                       <a:off x="0" y="0"/>
-                      <a:ext cx="5897880" cy="2448354"/>
+                      <a:ext cx="5897880" cy="2254632"/>
                     </a:xfrm>
                     <a:prstGeom prst="rect"/>
                   </pic:spPr>
@@ -549,7 +549,7 @@
           <w:color w:val="4C5963"/>
           <w:sz w:val="18"/>
         </w:rPr>
-        <w:t>Figure 2. Depth-wise replacement accuracy for ViT-B/16 AugReg and DINOv2 (N=1,000 images/model) under 25% spatial-patch replacement. Error bars show seed-level SD; dashed lines mark clean accuracy.</w:t>
+        <w:t>Figure 2. Depth-wise replacement accuracy for ViT-B/16 AugReg and DINOv2 under 25% spatial-patch replacement. Original V1 depths are 5, 7, 8, 9, and 10; depth 6 is a separately recorded follow-up. Each evaluation uses N=1,000 images/model. Error bars show Gaussian seed-level SD; dashed lines mark clean accuracy.</w:t>
       </w:r>
     </w:p>
     <w:p>
@@ -561,7 +561,7 @@
       <w:r>
         <w:drawing>
           <wp:inline xmlns:a="http://schemas.openxmlformats.org/drawingml/2006/main" xmlns:pic="http://schemas.openxmlformats.org/drawingml/2006/picture">
-            <wp:extent cx="5897880" cy="2213231"/>
+            <wp:extent cx="5897880" cy="2369564"/>
             <wp:docPr id="3" name="Picture 3"/>
             <wp:cNvGraphicFramePr>
               <a:graphicFrameLocks noChangeAspect="1"/>
@@ -582,7 +582,7 @@
                   <pic:spPr>
                     <a:xfrm>
                       <a:off x="0" y="0"/>
-                      <a:ext cx="5897880" cy="2213231"/>
+                      <a:ext cx="5897880" cy="2369564"/>
                     </a:xfrm>
                     <a:prstGeom prst="rect"/>
                   </pic:spPr>
@@ -605,7 +605,7 @@
           <w:color w:val="4C5963"/>
           <w:sz w:val="18"/>
         </w:rPr>
-        <w:t>Figure 3. Geometry controls at 50% replacement and complete-stream diversity results. V1 and V0.8 panels use N=1,000 evaluation images/model; calibration is disjoint in V0.8.</w:t>
+        <w:t>Figure 3. (a) V1 geometry controls at 50% replacement for ViT-B/16 AugReg and DINOv2 ViT-S/14 compare a calibration centroid, a coordinate-shuffled centroid, and a sign-inverted centroid. (b) The V0.8 grouped-diversity sweep on DeiT-Tiny and DeiT-Small varies K, the number of distinct replacement vectors across all 196 patch positions. Gray dashed lines mark each model's clean Top-1 accuracy. Bars and line markers show means; dots show recorded runs; error bars show across-seed SD where repeated seeds are available. Each model uses N=1,000 evaluation images and separate calibration data. These are distinct study cohorts, so compare conditions within each panel rather than treating absolute accuracy across panels as a matched-model contrast.</w:t>
       </w:r>
     </w:p>
     <w:p>
@@ -768,7 +768,7 @@
       <w:r>
         <w:drawing>
           <wp:inline xmlns:a="http://schemas.openxmlformats.org/drawingml/2006/main" xmlns:pic="http://schemas.openxmlformats.org/drawingml/2006/picture">
-            <wp:extent cx="5897880" cy="2619027"/>
+            <wp:extent cx="5897880" cy="2420268"/>
             <wp:docPr id="4" name="Picture 4"/>
             <wp:cNvGraphicFramePr>
               <a:graphicFrameLocks noChangeAspect="1"/>
@@ -789,7 +789,7 @@
                   <pic:spPr>
                     <a:xfrm>
                       <a:off x="0" y="0"/>
-                      <a:ext cx="5897880" cy="2619027"/>
+                      <a:ext cx="5897880" cy="2420268"/>
                     </a:xfrm>
                     <a:prstGeom prst="rect"/>
                   </pic:spPr>
@@ -824,7 +824,7 @@
       <w:r>
         <w:drawing>
           <wp:inline xmlns:a="http://schemas.openxmlformats.org/drawingml/2006/main" xmlns:pic="http://schemas.openxmlformats.org/drawingml/2006/picture">
-            <wp:extent cx="5897880" cy="2781363"/>
+            <wp:extent cx="5897880" cy="2515481"/>
             <wp:docPr id="5" name="Picture 5"/>
             <wp:cNvGraphicFramePr>
               <a:graphicFrameLocks noChangeAspect="1"/>
@@ -845,7 +845,7 @@
                   <pic:spPr>
                     <a:xfrm>
                       <a:off x="0" y="0"/>
-                      <a:ext cx="5897880" cy="2781363"/>
+                      <a:ext cx="5897880" cy="2515481"/>
                     </a:xfrm>
                     <a:prstGeom prst="rect"/>
                   </pic:spPr>
@@ -977,7 +977,7 @@
       <w:r>
         <w:drawing>
           <wp:inline xmlns:a="http://schemas.openxmlformats.org/drawingml/2006/main" xmlns:pic="http://schemas.openxmlformats.org/drawingml/2006/picture">
-            <wp:extent cx="5897880" cy="2496739"/>
+            <wp:extent cx="5897880" cy="2272931"/>
             <wp:docPr id="6" name="Picture 6"/>
             <wp:cNvGraphicFramePr>
               <a:graphicFrameLocks noChangeAspect="1"/>
@@ -998,7 +998,7 @@
                   <pic:spPr>
                     <a:xfrm>
                       <a:off x="0" y="0"/>
-                      <a:ext cx="5897880" cy="2496739"/>
+                      <a:ext cx="5897880" cy="2272931"/>
                     </a:xfrm>
                     <a:prstGeom prst="rect"/>
                   </pic:spPr>
@@ -1021,7 +1021,7 @@
           <w:color w:val="4C5963"/>
           <w:sz w:val="18"/>
         </w:rPr>
-        <w:t>Figure 6. Damage-prediction correlation for single-block and end-to-end multi-block operators on 100 held-out perturbations; the diagram summarizes downstream composition.</w:t>
+        <w:t>Figure 6. Damage-prediction correlation for single-block and end-to-end multi-block operators on 100 held-out perturbations; the diagram summarizes downstream composition, with a 49.0° mean principal angle from block 8 to 9.</w:t>
       </w:r>
     </w:p>
     <w:p>
@@ -1033,7 +1033,7 @@
       <w:r>
         <w:drawing>
           <wp:inline xmlns:a="http://schemas.openxmlformats.org/drawingml/2006/main" xmlns:pic="http://schemas.openxmlformats.org/drawingml/2006/picture">
-            <wp:extent cx="5897880" cy="3930089"/>
+            <wp:extent cx="5897880" cy="3501008"/>
             <wp:docPr id="7" name="Picture 7"/>
             <wp:cNvGraphicFramePr>
               <a:graphicFrameLocks noChangeAspect="1"/>
@@ -1054,7 +1054,7 @@
                   <pic:spPr>
                     <a:xfrm>
                       <a:off x="0" y="0"/>
-                      <a:ext cx="5897880" cy="3930089"/>
+                      <a:ext cx="5897880" cy="3501008"/>
                     </a:xfrm>
                     <a:prstGeom prst="rect"/>
                   </pic:spPr>
@@ -1186,7 +1186,7 @@
       <w:r>
         <w:drawing>
           <wp:inline xmlns:a="http://schemas.openxmlformats.org/drawingml/2006/main" xmlns:pic="http://schemas.openxmlformats.org/drawingml/2006/picture">
-            <wp:extent cx="5897880" cy="3831721"/>
+            <wp:extent cx="5897880" cy="3724381"/>
             <wp:docPr id="8" name="Picture 8"/>
             <wp:cNvGraphicFramePr>
               <a:graphicFrameLocks noChangeAspect="1"/>
@@ -1207,7 +1207,7 @@
                   <pic:spPr>
                     <a:xfrm>
                       <a:off x="0" y="0"/>
-                      <a:ext cx="5897880" cy="3831721"/>
+                      <a:ext cx="5897880" cy="3724381"/>
                     </a:xfrm>
                     <a:prstGeom prst="rect"/>
                   </pic:spPr>

</xml_diff>

<commit_message>
Replace Figure 1 overview with latest user image
</commit_message>
<xml_diff>
--- a/docs/PAPER_DRAFT_v4.docx
+++ b/docs/PAPER_DRAFT_v4.docx
@@ -71,7 +71,7 @@
           <w:color w:val="202A32"/>
           <w:sz w:val="21"/>
         </w:rPr>
-        <w:t xml:space="preserve">We study when a vision transformer (ViT) requires the image-specific content of an intermediate patch token and how token perturbations transmit to the final readout. Controlled activation replacement shows a late-layer regime in which some patch content is replaceable, subject to geometric and token-diversity constraints. Mechanistic audits identify strongly anisotropic functional transmission: token coherence and the attention Value path shape whether perturbations add or cancel, while downstream functional subspaces rotate across blocks. We use the end-to-end Jacobian to define operator-aware token compression and evaluate it in a strict confirmatory study on 1,000 held-out images per architecture. Against pruning baselines, operator-aware compression improves accuracy by approximately 4.2–17.3 percentage points at aggressive budgets; strong merging baselines remain close, with frontier gains on three of four tested architectures. Rank-16/32 approximations retain more than 98% of the </w:t>
+        <w:t xml:space="preserve">We study when a vision transformer (ViT) requires the image-specific content of an intermediate patch token and how token perturbations transmit to the final readout. In controlled interventions, we causally remove selected image-specific late-patch content and replace it with class-agnostic calibration surrogates while keeping token slots, sequence length, model weights, and the downstream computation path fixed. Unlike pruning or merging, this changes content while leaving the sequence intact. In the tested settings, some late-layer content is replaceable, subject to geometric and token-diversity constraints. Mechanistic audits identify strongly anisotropic functional transmission: token coherence and the attention Value path shape whether perturbations add or cancel, while downstream functional subspaces rotate across blocks. We use the end-to-end Jacobian to define operator-aware token compression and evaluate it in a strict confirmatory study on 1,000 held-out images per architecture. Against pruning baselines, operator-aware compression improves accuracy by approximately 4.2–17.3 percentage points at aggressive budgets; strong merging baselines remain close, with frontier gains on three of four tested architectures. Rank-16/32 approximations retain more than 98% of the </w:t>
       </w:r>
       <w:r>
         <w:rPr>
@@ -118,7 +118,7 @@
           <w:color w:val="202A32"/>
           <w:sz w:val="21"/>
         </w:rPr>
-        <w:t>Vision transformers process images as sequences of patch tokens  citep{dosovitskiy2020image,touvron2021training,oquab2024dinov2}. Token pruning and merging use this sequence structure to reduce computation, but changing the sequence also changes attention interactions  citep{rao2021dynamicvit,liang2022evit,bolya2022tome}. We instead intervene on patch activation content while holding token slots, sequence length, and downstream weights fixed. This asks whether a patch's particular activation is required by the remaining network, rather than whether a shorter sequence can preserve accuracy.</w:t>
+        <w:t>Vision transformers process images as sequences of patch tokens  citep{dosovitskiy2020image,touvron2021training,oquab2024dinov2}. Token pruning and merging use this sequence structure to reduce computation, but changing the sequence also changes attention interactions  citep{rao2021dynamicvit,liang2022evit,bolya2022tome}. We instead causally remove selected image-specific late-patch activations and replace them with class-agnostic calibration surrogates, while holding token slots, sequence length, model weights, and the downstream computation path fixed. This content-level intervention tests whether a patch's particular activation is required by the remaining network, unlike pruning or merging, which changes the sequence presented to later layers.</w:t>
       </w:r>
     </w:p>
     <w:p>
@@ -158,7 +158,7 @@
       <w:r>
         <w:drawing>
           <wp:inline xmlns:a="http://schemas.openxmlformats.org/drawingml/2006/main" xmlns:pic="http://schemas.openxmlformats.org/drawingml/2006/picture">
-            <wp:extent cx="5897880" cy="3446413"/>
+            <wp:extent cx="5897880" cy="3379948"/>
             <wp:docPr id="1" name="Picture 1"/>
             <wp:cNvGraphicFramePr>
               <a:graphicFrameLocks noChangeAspect="1"/>
@@ -179,7 +179,7 @@
                   <pic:spPr>
                     <a:xfrm>
                       <a:off x="0" y="0"/>
-                      <a:ext cx="5897880" cy="3446413"/>
+                      <a:ext cx="5897880" cy="3379948"/>
                     </a:xfrm>
                     <a:prstGeom prst="rect"/>
                   </pic:spPr>
@@ -202,7 +202,7 @@
           <w:color w:val="4C5963"/>
           <w:sz w:val="18"/>
         </w:rPr>
-        <w:t>Figure 1. Conceptual intervention and analysis path. The schematic is not a quantitative result.</w:t>
+        <w:t>Figure 1. Conceptual overview of (a) fixed-slot late-layer patch-content substitution, (b) geometry, token-diversity, and Value-path cancellation constraints, and (c) anisotropic downstream transmission. The schematic summarizes the paper’s mechanisms and is not a quantitative result.</w:t>
       </w:r>
     </w:p>
     <w:p>
@@ -493,7 +493,7 @@
           <w:color w:val="202A32"/>
           <w:sz w:val="21"/>
         </w:rPr>
-        <w:t xml:space="preserve"> by 1.474 (from 6.602 to 8.076); this is linearized operator-space evidence, not Top-1. Replacing an entire stream with identical replicas can collapse readout behavior; V0.8 diversity tests show that low-dimensional variation does not restore full performance and that the tested setting requires high-dimensional structure. These observations support constrained replaceability, not universal interchangeability and not a direct inference that tokens can be deleted at no cost.</w:t>
+        <w:t xml:space="preserve"> by 1.474 (from 6.602 to 8.076); this is linearized operator-space evidence, not Top-1. Replacing an entire stream with identical replicas can collapse readout behavior; V0.8 diversity tests show that low-dimensional variation does not restore full performance and that the tested setting requires high-dimensional structure. These observations support constrained replaceability, not universal interchangeability and not a direct inference that tokens can be deleted at no cost. The separate V0.9 low-dimensional replacement study at 100% patch replacement (N=1,000 evaluation images and a disjoint N=1,000 calibration set per DeiT model) finds higher Top-1 for learned PCA directions than for energy-matched random one-dimensional directions in its DeiT-Tiny/Small comparisons; this relative advantage is model- and amplitude-dependent and does not establish rank-1 sufficiency.</w:t>
       </w:r>
     </w:p>
     <w:p>
@@ -756,7 +756,7 @@
           <w:color w:val="202A32"/>
           <w:sz w:val="21"/>
         </w:rPr>
-        <w:t xml:space="preserve"> over a local one-block approximation; they do not imply exact nonlinear invariance. The functional-geometry pilot separately uses 100 images and supports an exploratory geometry result.</w:t>
+        <w:t xml:space="preserve"> over a local one-block approximation; they do not imply exact nonlinear invariance. In the separate N=100-image functional-geometry pilot, the threshold-defined downstream functional near-null subspace expands with depth while effective functional rank declines in late layers. This pattern is consistent with greater late-layer replacement tolerance measured in separate interventions, but remains an empirical mechanistic association rather than a theorem or universal explanation. A distinct joint-stream geometry audit (N=100 images per model) finds that downstream damage depends jointly on feature direction and token-space coherence: sensitive feature directions are most damaging under coherent token patterns, whereas functionally near-null directions remain comparatively tolerated across the tested patterns.</w:t>
       </w:r>
     </w:p>
     <w:p>

</xml_diff>

<commit_message>
Update PCF manuscript figures and PCA explanation
</commit_message>
<xml_diff>
--- a/docs/PAPER_DRAFT_v4.docx
+++ b/docs/PAPER_DRAFT_v4.docx
@@ -2093,7 +2093,7 @@
           <w:color w:val="202A32"/>
           <w:sz w:val="20"/>
         </w:rPr>
-        <w:t>Across the audited replacement controls, late-layer patch content is more replaceable than early-layer content, but arbitrary substitutions do not preserve function. The original V1 depthwise validation evaluates 1,000 images per architecture under 25% patch replacement. A separately recorded follow-up measured the previously unsampled depth 6 with the same split seeds, replacement fraction, controls, and 1,000-image calibration and evaluation sets for ViT-B/16 AugReg and DINOv2. At depth 6, centroid/Gaussian replacement gives 73.9%/74.9% for ViT-B and 70.6%/74.6% for DINOv2, compared with zero replacement at 71.5%/28.8%; Gaussian values are means over three seeds. Fig. 2 combines that follow-up with the original depths 5, 7, 8, 9, and 10. These results are conditional on the tested models, layer, replacement fraction, calibration distribution, and readout.</w:t>
+        <w:t>Across the audited replacement controls, late-layer patch content is more replaceable than early-layer content, but arbitrary substitutions do not preserve function. The original V1 depthwise validation evaluates 1,000 images per architecture under 25% patch replacement. A separately recorded follow-up measured the previously unsampled depth 6 with the same split seeds, replacement fraction, controls, and 1,000-image calibration and evaluation sets for ViT-B/16 AugReg and DINOv2. At depth 6, centroid/Gaussian replacement gives 73.9%/74.9% for ViT-B/16 AugReg and 70.6%/74.6% for DINOv2, compared with zero replacement at 71.5%/28.8%; Gaussian values are means over three seeds. Fig. 2 combines that follow-up with the original depths 5, 7, 8, 9, and 10. These results are conditional on the tested models, layer, replacement fraction, calibration distribution, and readout.</w:t>
       </w:r>
     </w:p>
     <w:p>
@@ -2262,7 +2262,7 @@
           <w:color w:val="202A32"/>
           <w:sz w:val="20"/>
         </w:rPr>
-        <w:t>Functional transmission is direction-dependent. In the attention causal audit (N=100 evaluation images), the frozen-attention Value-only path explains 70.8% of the defined coherence-gap margin effect in DeiT-Small and 102.2% in ViT-B. The same path reproduces approximately 97.4% and 99.3% of the immediate readout disturbance, respectively. The ratio above 100% in ViT-B is possible because a secondary contribution partially opposes the Value-path effect. Perturbing patch keys does not change the unperturbed classification-token query in this setup, so the immediate query contribution is zero; key-mediated rerouting remains secondary rather than absent. The frozen-attention algebraic parity check is not independent generalization evidence. Fig. 4 summarizes the audited depth-wise sensitivity pattern, and Fig. 5 compares coherent with sign-varying Value-path transmission.</w:t>
+        <w:t>Functional transmission is direction-dependent. In the attention causal audit (N=100 evaluation images), the frozen-attention Value-only path explains 70.8% of the defined coherence-gap margin effect in DeiT-Small and 102.2% in ViT-B/16 AugReg. The same path reproduces approximately 97.4% and 99.3% of the immediate readout disturbance, respectively. The ratio above 100% in ViT-B/16 AugReg is possible because a secondary contribution partially opposes the Value-path effect. Perturbing patch keys does not change the unperturbed classification-token query in this setup, so the immediate query contribution is zero; key-mediated rerouting remains secondary rather than absent. The frozen-attention algebraic parity check is not independent generalization evidence. Fig. 4 summarizes the audited depth-wise sensitivity pattern, and Fig. 5 compares coherent with sign-varying Value-path transmission.</w:t>
       </w:r>
     </w:p>
     <w:p>
@@ -2274,7 +2274,7 @@
       <w:r>
         <w:drawing>
           <wp:inline xmlns:a="http://schemas.openxmlformats.org/drawingml/2006/main" xmlns:pic="http://schemas.openxmlformats.org/drawingml/2006/picture">
-            <wp:extent cx="6172200" cy="2532839"/>
+            <wp:extent cx="6172200" cy="1942418"/>
             <wp:docPr id="4" name="Picture 4"/>
             <wp:cNvGraphicFramePr>
               <a:graphicFrameLocks noChangeAspect="1"/>
@@ -2295,7 +2295,7 @@
                   <pic:spPr>
                     <a:xfrm>
                       <a:off x="0" y="0"/>
-                      <a:ext cx="6172200" cy="2532839"/>
+                      <a:ext cx="6172200" cy="1942418"/>
                     </a:xfrm>
                     <a:prstGeom prst="rect"/>
                   </pic:spPr>
@@ -2318,7 +2318,7 @@
           <w:color w:val="4C5963"/>
           <w:sz w:val="17"/>
         </w:rPr>
-        <w:t>Fig. 4. Ratio between the leading-principal-component and bottom-principal-component sensitivity across depths in the N=100 functional-geometry pilot. The vector diagram is explanatory.</w:t>
+        <w:t>Fig. 4. (a) Ratio of downstream sensitivity along PC1 (the activation direction with the largest calibration variance) to sensitivity along the lowest-variance PC (the direction with the smallest calibration variance), across depths in the N=100 functional-geometry pilot. (b) Depth-8 PCA score-density maps for DeiT-Small and ViT-B/16 AugReg. Each observation is a patch activation from the 100-image pilot cohort; axes are standardized per model and component to show the score distributions, so the plotted spread does not represent their raw variance difference. Patch tokens are not independent image samples; downstream sensitivity is measured in (a).</w:t>
       </w:r>
     </w:p>
     <w:p>
@@ -2442,7 +2442,7 @@
       <w:r>
         <w:drawing>
           <wp:inline xmlns:a="http://schemas.openxmlformats.org/drawingml/2006/main" xmlns:pic="http://schemas.openxmlformats.org/drawingml/2006/picture">
-            <wp:extent cx="6172200" cy="2378649"/>
+            <wp:extent cx="6172200" cy="2285067"/>
             <wp:docPr id="6" name="Picture 6"/>
             <wp:cNvGraphicFramePr>
               <a:graphicFrameLocks noChangeAspect="1"/>
@@ -2463,7 +2463,7 @@
                   <pic:spPr>
                     <a:xfrm>
                       <a:off x="0" y="0"/>
-                      <a:ext cx="6172200" cy="2378649"/>
+                      <a:ext cx="6172200" cy="2285067"/>
                     </a:xfrm>
                     <a:prstGeom prst="rect"/>
                   </pic:spPr>
@@ -2486,7 +2486,7 @@
           <w:color w:val="4C5963"/>
           <w:sz w:val="17"/>
         </w:rPr>
-        <w:t>Fig. 6. Damage-prediction correlation for single-block and end-to-end multi-block operators on 100 held-out perturbations; the diagram summarizes downstream composition, with a 49.0-degree mean principal angle from block 8 to block 9.</w:t>
+        <w:t>Fig. 6. Pearson and Spearman correlations between the single-block operator A₈ and end-to-end Jacobian J₈→₁₂ predictions and measured final-logit L2 damage on N=100 held-out perturbations. J₈→₁₂ composes blocks 9–12 and the final normalization/CLS readout. The mean principal angle from block 8 to block 9 is 49.0°.</w:t>
       </w:r>
     </w:p>
     <w:p>
@@ -2557,7 +2557,7 @@
           <w:color w:val="202A32"/>
           <w:sz w:val="20"/>
         </w:rPr>
-        <w:t>Strict confirmatory compression uses N=1,000 held-out images per architecture. At each architecture’s most aggressive tested token budget, Table II reports the exact Top-1 comparison among the best pruning baseline, Group Mean, ToMe, the full-J oracle, and its rank-16 and rank-32 approximations. The selected budgets differ by architecture (32 retained tokens for DeiT-Tiny, DeiT-Small, and ViT-B/16; 42 for DINOv2 ViT-S/14), so the rows are within-architecture comparisons rather than a matched token-count experiment. Fig. 7 presents the full accuracy-token curves.</w:t>
+        <w:t>Strict confirmatory compression uses N=1,000 held-out images per architecture. At each architecture’s most aggressive tested token budget, Table II reports the exact Top-1 comparison among the best pruning baseline, Group Mean, ToMe, the full-J oracle, and its rank-16 and rank-32 approximations. The selected budgets differ by architecture (32 retained tokens for DeiT-Tiny, DeiT-Small, and ViT-B/16 AugReg; 42 for DINOv2 ViT-S/14), so the rows are within-architecture comparisons rather than a matched token-count experiment. Fig. 7 presents the full accuracy-token curves.</w:t>
       </w:r>
     </w:p>
     <w:p>
@@ -3316,7 +3316,7 @@
                 <w:color w:val="202A32"/>
                 <w:sz w:val="15"/>
               </w:rPr>
-              <w:t>ViT-B/16</w:t>
+              <w:t>ViT-B/16 AugReg</w:t>
             </w:r>
           </w:p>
         </w:tc>
@@ -4798,7 +4798,7 @@
           <w:color w:val="202A32"/>
           <w:sz w:val="20"/>
         </w:rPr>
-        <w:t>The real-final benchmark evaluates actual model predictions on N=1,000 held-out images per architecture. Compact Feature-PCA corrections do not consistently improve classification: both DeiT-Small budgets and the aggressive DINOv2 budget are at or below Hybrid Group Mean, while ViT-B/16 has a limited positive case. Fig. S1 shows the separate full-model throughput boundary; it does not establish a general deployment improvement.</w:t>
+        <w:t>The real-final benchmark evaluates actual model predictions on N=1,000 held-out images per architecture. Compact Feature-PCA corrections do not consistently improve classification: both DeiT-Small budgets and the aggressive DINOv2 budget are at or below Hybrid Group Mean, while ViT-B/16 AugReg has a limited positive case. Fig. S1 shows the separate full-model throughput boundary; it does not establish a general deployment improvement.</w:t>
       </w:r>
     </w:p>
     <w:p>
@@ -4854,7 +4854,7 @@
           <w:color w:val="4C5963"/>
           <w:sz w:val="17"/>
         </w:rPr>
-        <w:t>Fig. S1. Real-final classification and full-model throughput at batch size 64; q=16 has a narrow ViT-B/16 frontier contribution.</w:t>
+        <w:t>Fig. S1. Real-final classification and full-model throughput at batch size 64; q=16 has a narrow ViT-B/16 AugReg frontier contribution.</w:t>
       </w:r>
     </w:p>
     <w:p>
@@ -4885,7 +4885,7 @@
           <w:color w:val="202A32"/>
           <w:sz w:val="20"/>
         </w:rPr>
-        <w:t>: Clean is non-dominated in several regimes, Group Mean is a practical batched baseline, and static q=16 adds a narrow ViT-B/16 point at some batch sizes. q=32 and selective q=16 do not establish a general frontier improvement. Full-call measurements are not isolated operator overhead.</w:t>
+        <w:t>: Clean is non-dominated in several regimes, Group Mean is a practical batched baseline, and static q=16 adds a narrow ViT-B/16 AugReg point at some batch sizes. q=32 and selective q=16 do not establish a general frontier improvement. Full-call measurements are not isolated operator overhead.</w:t>
       </w:r>
     </w:p>
     <w:p>

</xml_diff>